<commit_message>
Completa texto de edição da Marketing Thesis nos briefings 05 e 06
Co-Authored-By: Claude Fable 5.1 <noreply@anthropic.com>
Claude-Session: https://claude.ai/code/session_017HYp1xhSzB6Ui5hyJvLbGE
</commit_message>
<xml_diff>
--- a/analise-ed/05_Briefing_Edicao_JellyFil_extraido.docx
+++ b/analise-ed/05_Briefing_Edicao_JellyFil_extraido.docx
@@ -2452,20 +2452,92 @@
         </w:numPr>
       </w:pPr>
       <w:r>
-        <w:t xml:space="preserve">Resumo / legenda / trilha:</w:t>
-      </w:r>
-      <w:r>
-        <w:t xml:space="preserve"> </w:t>
-      </w:r>
-      <w:r>
-        <w:rPr>
-          <w:bCs/>
-          <w:b/>
-        </w:rPr>
-        <w:t xml:space="preserve">(aguardando print do texto)</w:t>
-      </w:r>
-      <w:r>
-        <w:t xml:space="preserve">.</w:t>
+        <w:rPr>
+          <w:bCs/>
+          <w:b/>
+        </w:rPr>
+        <w:t xml:space="preserve">Resumo:</w:t>
+      </w:r>
+      <w:r>
+        <w:t xml:space="preserve"> </w:t>
+      </w:r>
+      <w:r>
+        <w:t xml:space="preserve">Muita prova, uns trechos com até 4 ou 5 provas seguidas.</w:t>
+      </w:r>
+      <w:r>
+        <w:t xml:space="preserve"> </w:t>
+      </w:r>
+      <w:r>
+        <w:t xml:space="preserve">“</w:t>
+      </w:r>
+      <w:r>
+        <w:t xml:space="preserve">Deixam tudo extremamente visual, acredito que o poder de escala dessa VSL veio daqui.</w:t>
+      </w:r>
+      <w:r>
+        <w:t xml:space="preserve">”</w:t>
+      </w:r>
+    </w:p>
+    <w:p>
+      <w:pPr>
+        <w:numPr>
+          <w:ilvl w:val="0"/>
+          <w:numId w:val="1017"/>
+        </w:numPr>
+      </w:pPr>
+      <w:r>
+        <w:rPr>
+          <w:bCs/>
+          <w:b/>
+        </w:rPr>
+        <w:t xml:space="preserve">Legenda:</w:t>
+      </w:r>
+      <w:r>
+        <w:t xml:space="preserve"> </w:t>
+      </w:r>
+      <w:r>
+        <w:t xml:space="preserve">mesma ideia.</w:t>
+      </w:r>
+    </w:p>
+    <w:p>
+      <w:pPr>
+        <w:numPr>
+          <w:ilvl w:val="0"/>
+          <w:numId w:val="1017"/>
+        </w:numPr>
+      </w:pPr>
+      <w:r>
+        <w:rPr>
+          <w:bCs/>
+          <w:b/>
+        </w:rPr>
+        <w:t xml:space="preserve">Trilha sonora:</w:t>
+      </w:r>
+      <w:r>
+        <w:t xml:space="preserve"> </w:t>
+      </w:r>
+      <w:r>
+        <w:t xml:space="preserve">Melodia intrigante → muda para um beat (meio sexy) → em dado momento fica tenso, bate até um coração → muda bastante a trilha ao longo do bloco.</w:t>
+      </w:r>
+    </w:p>
+    <w:p>
+      <w:pPr>
+        <w:numPr>
+          <w:ilvl w:val="0"/>
+          <w:numId w:val="1017"/>
+        </w:numPr>
+      </w:pPr>
+      <w:r>
+        <w:rPr>
+          <w:bCs/>
+          <w:b/>
+        </w:rPr>
+        <w:t xml:space="preserve">Tipos de B-roll usados (lista do briefing):</w:t>
+      </w:r>
+      <w:r>
+        <w:t xml:space="preserve"> </w:t>
+      </w:r>
+      <w:r>
+        <w:t xml:space="preserve">cinematografia · cinematografia com IA · jogando pesticida nas comidas · provas científicas (estudos) · 3D anatômico · prova jornalística (físico e digital) · top secret · provas confidenciais · homem broxa · prova de vídeo removido · prova em formato de quadro de detetive · pornô · prova visual de microscópio · prova dentro de livro médico · soluções comuns · mulher traindo · MUITA prova visual.</w:t>
       </w:r>
     </w:p>
     <w:p>
@@ -8355,7 +8427,7 @@
               <w:jc w:val="left"/>
             </w:pPr>
             <w:r>
-              <w:t xml:space="preserve">(texto não recebido)</w:t>
+              <w:t xml:space="preserve">Intrigante → beat sexy → tenso com batida de coração; muda muito</w:t>
             </w:r>
           </w:p>
         </w:tc>
@@ -8379,7 +8451,7 @@
               <w:jc w:val="left"/>
             </w:pPr>
             <w:r>
-              <w:t xml:space="preserve">Média-alta</w:t>
+              <w:t xml:space="preserve">Alta (4-5 provas seguidas)</w:t>
             </w:r>
           </w:p>
         </w:tc>
@@ -8769,6 +8841,50 @@
       <w:r>
         <w:t xml:space="preserve">10. Legenda grande colorida só em pico de benefício/número/título; o resto é pequena branca inferior.</w:t>
       </w:r>
+      <w:r>
+        <w:t xml:space="preserve"> </w:t>
+      </w:r>
+      <w:r>
+        <w:t xml:space="preserve">11.</w:t>
+      </w:r>
+      <w:r>
+        <w:t xml:space="preserve"> </w:t>
+      </w:r>
+      <w:r>
+        <w:rPr>
+          <w:bCs/>
+          <w:b/>
+        </w:rPr>
+        <w:t xml:space="preserve">A tese é o bloco de maior densidade de prova</w:t>
+      </w:r>
+      <w:r>
+        <w:t xml:space="preserve"> </w:t>
+      </w:r>
+      <w:r>
+        <w:t xml:space="preserve">(até 4-5 provas visuais consecutivas para uma afirmação) e é apontada pelo próprio briefing como a provável fonte do poder de escala da VSL. Não economizar prova visual ali.</w:t>
+      </w:r>
+      <w:r>
+        <w:t xml:space="preserve"> </w:t>
+      </w:r>
+      <w:r>
+        <w:t xml:space="preserve">12.</w:t>
+      </w:r>
+      <w:r>
+        <w:t xml:space="preserve"> </w:t>
+      </w:r>
+      <w:r>
+        <w:rPr>
+          <w:bCs/>
+          <w:b/>
+        </w:rPr>
+        <w:t xml:space="preserve">A trilha da tese não é estável:</w:t>
+      </w:r>
+      <w:r>
+        <w:t xml:space="preserve"> </w:t>
+      </w:r>
+      <w:r>
+        <w:t xml:space="preserve">intrigante → beat sexy → tensão com batida de coração. A música acompanha o ponto lógico (conspiração = tensão, benefício = sexy), não o bloco.</w:t>
+      </w:r>
     </w:p>
     <w:p>
       <w:r>
@@ -8778,13 +8894,13 @@
       </w:r>
     </w:p>
     <w:bookmarkEnd w:id="44"/>
-    <w:bookmarkStart w:id="45" w:name="pendente"/>
+    <w:bookmarkStart w:id="45" w:name="status"/>
     <w:p>
       <w:pPr>
         <w:pStyle w:val="Heading2"/>
       </w:pPr>
       <w:r>
-        <w:t xml:space="preserve">Pendente</w:t>
+        <w:t xml:space="preserve">Status</w:t>
       </w:r>
     </w:p>
     <w:p>
@@ -8796,7 +8912,7 @@
         <w:pStyle w:val="Compact"/>
       </w:pPr>
       <w:r>
-        <w:t xml:space="preserve">Marketing Thesis — texto da seção 2 Edição (resumo, legenda, trilha). Inventário de B-rolls completo.</w:t>
+        <w:t xml:space="preserve">Extração completa. Todos os blocos com produção, edição e B-rolls.</w:t>
       </w:r>
     </w:p>
     <w:bookmarkEnd w:id="45"/>

</xml_diff>